<commit_message>
reskin-provisions-press: 5.1 accessibility pass — Dynamic Type-relative type roles (title/title3/subheadline), dark + contrast verified; insights + journal
</commit_message>
<xml_diff>
--- a/docs/newsletters/2026.04.21 - 009 - The Parser That Had to Learn.docx
+++ b/docs/newsletters/2026.04.21 - 009 - The Parser That Had to Learn.docx
@@ -7,7 +7,13 @@
         <w:pStyle w:val="NoSpacing"/>
       </w:pPr>
       <w:r>
-        <w:t>Systems Over Vibes #8: The Parser That Had to Learn</w:t>
+        <w:t>Systems Over Vibes #</w:t>
+      </w:r>
+      <w:r>
+        <w:t>9</w:t>
+      </w:r>
+      <w:r>
+        <w:t>: The Parser That Had to Learn</w:t>
       </w:r>
     </w:p>
     <w:p>
@@ -87,21 +93,33 @@
         <w:pStyle w:val="NoSpacing"/>
       </w:pPr>
       <w:r>
-        <w:t xml:space="preserve">The first version was pattern matching. The technical name is regular expressions, often shortened to regex, but the concept is simple: the parser looks for specific shapes in the text and pulls out the pieces. A number followed by a unit followed by a name fits a pattern. So does a number </w:t>
-      </w:r>
-      <w:proofErr w:type="gramStart"/>
-      <w:r>
-        <w:t>followed</w:t>
-      </w:r>
-      <w:proofErr w:type="gramEnd"/>
-      <w:r>
-        <w:t xml:space="preserve"> by a name with no unit, like "3 eggs." Pattern matching was the right choice for version one because it's fast, it's predictable, and when it works it works perfectly. The trade-off is that it only handles the cases you anticipated. Anything the user writes that doesn't fit a pre-defined shape comes back as a low-confidence guess or no match at all. That was acceptable because starting here meant I could ship something real and start gathering data about what was </w:t>
-      </w:r>
-      <w:proofErr w:type="gramStart"/>
-      <w:r>
-        <w:t>actually breaking</w:t>
-      </w:r>
-      <w:proofErr w:type="gramEnd"/>
+        <w:t>The first version was pattern matching. The technical name is regular expressions, often shortened to regex, but the concept is simple: the parser looks for specific shapes in the text and pulls out the pieces. A number followed by a unit followed by a name fits a pattern. So does a number followed by a name with no unit, like "3 eggs." Pattern matching was the right choice for version one because it's fast, it's predictable, and when it works it works perfectly. The trade-off is that it only handles the cases you anticipated. Anything the user writes that doesn't fit a pre-defined shape comes back as a low-confidence guess or no match at all. That was acceptable because starting here meant I could ship something real and start gathering data about what was actually breaking.</w:t>
+      </w:r>
+    </w:p>
+    <w:p>
+      <w:pPr>
+        <w:pStyle w:val="NoSpacing"/>
+      </w:pPr>
+    </w:p>
+    <w:p>
+      <w:pPr>
+        <w:pStyle w:val="NoSpacing"/>
+      </w:pPr>
+      <w:r>
+        <w:t xml:space="preserve">The data gathering mattered as much as the parser itself. Every time a user edited an ingredient after the parser took its first crack, </w:t>
+      </w:r>
+      <w:r>
+        <w:t>f</w:t>
+      </w:r>
+      <w:r>
+        <w:t>orager recorded what came in, what came out, and what the user changed it to. That logging was the single most valuable design decision I made in the whole parsing track. Months later, when I wanted to try something more ambitious, I had a real dataset of things the existing parser was getting wrong. Not a synthetic test suite. Not my imagination</w:t>
+      </w:r>
+      <w:r>
+        <w:t>, a</w:t>
+      </w:r>
+      <w:r>
+        <w:t>ctual corrections from beta testers</w:t>
+      </w:r>
       <w:r>
         <w:t>.</w:t>
       </w:r>
@@ -116,44 +134,8 @@
         <w:pStyle w:val="NoSpacing"/>
       </w:pPr>
       <w:r>
-        <w:t xml:space="preserve">The data gathering mattered as much as the parser itself. Every time a user edited an ingredient after the parser took its first crack, </w:t>
-      </w:r>
-      <w:r>
-        <w:t>f</w:t>
-      </w:r>
-      <w:r>
-        <w:t>orager recorded what came in, what came out, and what the user changed it to. That logging was the single most valuable design decision I made in the whole parsing track. Months later, when I wanted to try something more ambitious, I had a real dataset of things the existing parser was getting wrong. Not a synthetic test suite. Not my imagination</w:t>
-      </w:r>
-      <w:r>
-        <w:t>, a</w:t>
-      </w:r>
-      <w:r>
-        <w:t>ctual corrections from beta testers</w:t>
-      </w:r>
-      <w:r>
-        <w:t>.</w:t>
-      </w:r>
-    </w:p>
-    <w:p>
-      <w:pPr>
-        <w:pStyle w:val="NoSpacing"/>
-      </w:pPr>
-    </w:p>
-    <w:p>
-      <w:pPr>
-        <w:pStyle w:val="NoSpacing"/>
-      </w:pPr>
-      <w:r>
         <w:lastRenderedPageBreak/>
-        <w:t xml:space="preserve">An LLM will happily generate an ambitious first version of anything, and it will feel great while it does. But the version you ship </w:t>
-      </w:r>
-      <w:proofErr w:type="gramStart"/>
-      <w:r>
-        <w:t>has to</w:t>
-      </w:r>
-      <w:proofErr w:type="gramEnd"/>
-      <w:r>
-        <w:t xml:space="preserve"> be observable, because no amount of upfront cleverness replaces watching the thing fail in real life. Shipping something imperfect and letting the data tell you what to fix is almost always better than trying to ship perfect from the start.</w:t>
+        <w:t>An LLM will happily generate an ambitious first version of anything, and it will feel great while it does. But the version you ship has to be observable, because no amount of upfront cleverness replaces watching the thing fail in real life. Shipping something imperfect and letting the data tell you what to fix is almost always better than trying to ship perfect from the start.</w:t>
       </w:r>
     </w:p>
     <w:p>
@@ -198,21 +180,7 @@
         <w:pStyle w:val="NoSpacing"/>
       </w:pPr>
       <w:r>
-        <w:t xml:space="preserve">The ambitious version came later. By that point I had enough logging data to see the patterns the second parser was still missing. Range quantities like "1 to 2 cups." Notes inside parentheses. Ingredients where multiple descriptors stacked up in ways neither layer could untangle reliably. What I </w:t>
-      </w:r>
-      <w:proofErr w:type="gramStart"/>
-      <w:r>
-        <w:t>actually wanted</w:t>
-      </w:r>
-      <w:proofErr w:type="gramEnd"/>
-      <w:r>
-        <w:t xml:space="preserve"> was a parser that understood the structure of ingredient text the way a fluent English speaker does, intuitively, by reading it in context. That meant training a small AI model. The kind I needed reads a sentence one word at a time and labels each word with its role: this is a quantity, this is a unit, this is part of the ingredient name, this is a preparation note. It learns these patterns by being shown tens of thousands of pre-labeled examples until it can do the labeling on its own for new sentences it has never seen. Researchers have been using this kind of model for ingredient parsing for years, and there's a public dataset of about 68,000 labeled ingredients available online. This approach was the right reach because the previous two layers had hit a ceiling on the kinds of ambiguity that only context can resolve, and because the model could run entirely on the phone, which meant no internet connection required and no per-request cost. The first training run produced a model that hit every accuracy target I'd set on the first </w:t>
-      </w:r>
-      <w:r>
-        <w:t>attempt and</w:t>
-      </w:r>
-      <w:r>
-        <w:t xml:space="preserve"> slotted into the system as the new middle layer between pattern matching and natural language.</w:t>
+        <w:t>The ambitious version came later. By that point I had enough logging data to see the patterns the second parser was still missing. Range quantities like "1 to 2 cups." Notes inside parentheses. Ingredients where multiple descriptors stacked up in ways neither layer could untangle reliably. What I actually wanted was a parser that understood the structure of ingredient text the way a fluent English speaker does, intuitively, by reading it in context. That meant training a small AI model. The kind I needed reads a sentence one word at a time and labels each word with its role: this is a quantity, this is a unit, this is part of the ingredient name, this is a preparation note. It learns these patterns by being shown tens of thousands of pre-labeled examples until it can do the labeling on its own for new sentences it has never seen. Researchers have been using this kind of model for ingredient parsing for years, and there's a public dataset of about 68,000 labeled ingredients available online. This approach was the right reach because the previous two layers had hit a ceiling on the kinds of ambiguity that only context can resolve, and because the model could run entirely on the phone, which meant no internet connection required and no per-request cost. The first training run produced a model that hit every accuracy target I'd set on the first attempt and slotted into the system as the new middle layer between pattern matching and natural language.</w:t>
       </w:r>
     </w:p>
     <w:p>
@@ -239,15 +207,7 @@
         <w:pStyle w:val="NoSpacing"/>
       </w:pPr>
       <w:r>
-        <w:t xml:space="preserve">That's the leverage I keep seeing with AI-assisted engineering. It isn't faster code generation. It's the ability to reach for ambitious tools you otherwise wouldn't, because the cost of trying has gone from weeks to an afternoon. The judgment calls are still yours, and you still </w:t>
-      </w:r>
-      <w:proofErr w:type="gramStart"/>
-      <w:r>
-        <w:t>have to</w:t>
-      </w:r>
-      <w:proofErr w:type="gramEnd"/>
-      <w:r>
-        <w:t xml:space="preserve"> know when the AI is confident and wrong. But the set of projects a solo engineer can realistically attempt has expanded in a way that would have sounded like marketing copy a few years ago and is now just the day-to-day reality of how I work.</w:t>
+        <w:t>That's the leverage I keep seeing with AI-assisted engineering. It isn't faster code generation. It's the ability to reach for ambitious tools you otherwise wouldn't, because the cost of trying has gone from weeks to an afternoon. The judgment calls are still yours, and you still have to know when the AI is confident and wrong. But the set of projects a solo engineer can realistically attempt has expanded in a way that would have sounded like marketing copy a few years ago and is now just the day-to-day reality of how I work.</w:t>
       </w:r>
     </w:p>
     <w:p>

</xml_diff>